<commit_message>
UAMap: v1.45: Relay switch patterns UAMapApiTester added
</commit_message>
<xml_diff>
--- a/UAMap/doc/UAMap WiFi Settings Setup.docx
+++ b/UAMap/doc/UAMap WiFi Settings Setup.docx
@@ -1,6 +1,6 @@
 
 <file path=word/document.xml><?xml version="1.0" encoding="utf-8"?>
-<w:document xmlns:wpc="http://schemas.microsoft.com/office/word/2010/wordprocessingCanvas" xmlns:cx="http://schemas.microsoft.com/office/drawing/2014/chartex" xmlns:cx1="http://schemas.microsoft.com/office/drawing/2015/9/8/chartex" xmlns:cx2="http://schemas.microsoft.com/office/drawing/2015/10/21/chartex" xmlns:cx3="http://schemas.microsoft.com/office/drawing/2016/5/9/chartex" xmlns:cx4="http://schemas.microsoft.com/office/drawing/2016/5/10/chartex" xmlns:cx5="http://schemas.microsoft.com/office/drawing/2016/5/11/chartex" xmlns:cx6="http://schemas.microsoft.com/office/drawing/2016/5/12/chartex" xmlns:cx7="http://schemas.microsoft.com/office/drawing/2016/5/13/chartex" xmlns:cx8="http://schemas.microsoft.com/office/drawing/2016/5/14/chartex" xmlns:mc="http://schemas.openxmlformats.org/markup-compatibility/2006" xmlns:aink="http://schemas.microsoft.com/office/drawing/2016/ink" xmlns:am3d="http://schemas.microsoft.com/office/drawing/2017/model3d" xmlns:o="urn:schemas-microsoft-com:office:office" xmlns:oel="http://schemas.microsoft.com/office/2019/extlst" xmlns:r="http://schemas.openxmlformats.org/officeDocument/2006/relationships" xmlns:m="http://schemas.openxmlformats.org/officeDocument/2006/math" xmlns:v="urn:schemas-microsoft-com:vml" xmlns:wp14="http://schemas.microsoft.com/office/word/2010/wordprocessingDrawing" xmlns:wp="http://schemas.openxmlformats.org/drawingml/2006/wordprocessingDrawing" xmlns:w10="urn:schemas-microsoft-com:office:word" xmlns:w="http://schemas.openxmlformats.org/wordprocessingml/2006/main" xmlns:w14="http://schemas.microsoft.com/office/word/2010/wordml" xmlns:w15="http://schemas.microsoft.com/office/word/2012/wordml" xmlns:w16cex="http://schemas.microsoft.com/office/word/2018/wordml/cex" xmlns:w16cid="http://schemas.microsoft.com/office/word/2016/wordml/cid" xmlns:w16="http://schemas.microsoft.com/office/word/2018/wordml" xmlns:w16du="http://schemas.microsoft.com/office/word/2023/wordml/word16du" xmlns:w16sdtdh="http://schemas.microsoft.com/office/word/2020/wordml/sdtdatahash" xmlns:w16se="http://schemas.microsoft.com/office/word/2015/wordml/symex" xmlns:wpg="http://schemas.microsoft.com/office/word/2010/wordprocessingGroup" xmlns:wpi="http://schemas.microsoft.com/office/word/2010/wordprocessingInk" xmlns:wne="http://schemas.microsoft.com/office/word/2006/wordml" xmlns:wps="http://schemas.microsoft.com/office/word/2010/wordprocessingShape" mc:Ignorable="w14 w15 w16se w16cid w16 w16cex w16sdtdh w16du wp14">
+<w:document xmlns:wpc="http://schemas.microsoft.com/office/word/2010/wordprocessingCanvas" xmlns:cx="http://schemas.microsoft.com/office/drawing/2014/chartex" xmlns:cx1="http://schemas.microsoft.com/office/drawing/2015/9/8/chartex" xmlns:cx2="http://schemas.microsoft.com/office/drawing/2015/10/21/chartex" xmlns:cx3="http://schemas.microsoft.com/office/drawing/2016/5/9/chartex" xmlns:cx4="http://schemas.microsoft.com/office/drawing/2016/5/10/chartex" xmlns:cx5="http://schemas.microsoft.com/office/drawing/2016/5/11/chartex" xmlns:cx6="http://schemas.microsoft.com/office/drawing/2016/5/12/chartex" xmlns:cx7="http://schemas.microsoft.com/office/drawing/2016/5/13/chartex" xmlns:cx8="http://schemas.microsoft.com/office/drawing/2016/5/14/chartex" xmlns:mc="http://schemas.openxmlformats.org/markup-compatibility/2006" xmlns:aink="http://schemas.microsoft.com/office/drawing/2016/ink" xmlns:am3d="http://schemas.microsoft.com/office/drawing/2017/model3d" xmlns:o="urn:schemas-microsoft-com:office:office" xmlns:oel="http://schemas.microsoft.com/office/2019/extlst" xmlns:r="http://schemas.openxmlformats.org/officeDocument/2006/relationships" xmlns:m="http://schemas.openxmlformats.org/officeDocument/2006/math" xmlns:v="urn:schemas-microsoft-com:vml" xmlns:wp14="http://schemas.microsoft.com/office/word/2010/wordprocessingDrawing" xmlns:wp="http://schemas.openxmlformats.org/drawingml/2006/wordprocessingDrawing" xmlns:w10="urn:schemas-microsoft-com:office:word" xmlns:w="http://schemas.openxmlformats.org/wordprocessingml/2006/main" xmlns:w14="http://schemas.microsoft.com/office/word/2010/wordml" xmlns:w15="http://schemas.microsoft.com/office/word/2012/wordml" xmlns:w16cex="http://schemas.microsoft.com/office/word/2018/wordml/cex" xmlns:w16cid="http://schemas.microsoft.com/office/word/2016/wordml/cid" xmlns:w16="http://schemas.microsoft.com/office/word/2018/wordml" xmlns:w16du="http://schemas.microsoft.com/office/word/2023/wordml/word16du" xmlns:w16sdtdh="http://schemas.microsoft.com/office/word/2020/wordml/sdtdatahash" xmlns:w16sdtfl="http://schemas.microsoft.com/office/word/2024/wordml/sdtformatlock" xmlns:w16se="http://schemas.microsoft.com/office/word/2015/wordml/symex" xmlns:wpg="http://schemas.microsoft.com/office/word/2010/wordprocessingGroup" xmlns:wpi="http://schemas.microsoft.com/office/word/2010/wordprocessingInk" xmlns:wne="http://schemas.microsoft.com/office/word/2006/wordml" xmlns:wps="http://schemas.microsoft.com/office/word/2010/wordprocessingShape" mc:Ignorable="w14 w15 w16se w16cid w16 w16cex w16sdtdh w16sdtfl w16du wp14">
   <w:body>
     <w:p>
       <w:pPr>
@@ -86,6 +86,7 @@
           </wp:anchor>
         </w:drawing>
       </w:r>
+      <w:proofErr w:type="spellStart"/>
       <w:r>
         <w:rPr>
           <w:sz w:val="40"/>
@@ -93,6 +94,7 @@
         </w:rPr>
         <w:t>Kyiv</w:t>
       </w:r>
+      <w:proofErr w:type="spellEnd"/>
       <w:r>
         <w:rPr>
           <w:sz w:val="40"/>
@@ -471,7 +473,21 @@
         <w:rPr>
           <w:lang w:val="en-US"/>
         </w:rPr>
-        <w:t>Expand WiFi Networks 2. Find UAMap_</w:t>
+        <w:t xml:space="preserve">Expand </w:t>
+      </w:r>
+      <w:proofErr w:type="spellStart"/>
+      <w:r>
+        <w:rPr>
+          <w:lang w:val="en-US"/>
+        </w:rPr>
+        <w:t>WiFi</w:t>
+      </w:r>
+      <w:proofErr w:type="spellEnd"/>
+      <w:r>
+        <w:rPr>
+          <w:lang w:val="en-US"/>
+        </w:rPr>
+        <w:t xml:space="preserve"> Networks 2. Find UAMap_</w:t>
       </w:r>
       <w:proofErr w:type="gramStart"/>
       <w:r>
@@ -517,7 +533,7 @@
           <w:noProof/>
         </w:rPr>
         <w:drawing>
-          <wp:anchor distT="0" distB="0" distL="114300" distR="114300" simplePos="0" relativeHeight="251609600" behindDoc="1" locked="0" layoutInCell="1" allowOverlap="1" wp14:anchorId="723AFCFE" wp14:editId="2C4E41D4">
+          <wp:anchor distT="0" distB="0" distL="114300" distR="114300" simplePos="0" relativeHeight="251609600" behindDoc="1" locked="0" layoutInCell="1" allowOverlap="1" wp14:anchorId="723AFCFE" wp14:editId="11158AA3">
             <wp:simplePos x="0" y="0"/>
             <wp:positionH relativeFrom="column">
               <wp:posOffset>0</wp:posOffset>
@@ -824,7 +840,35 @@
         <w:rPr>
           <w:lang w:val="en-US"/>
         </w:rPr>
-        <w:t xml:space="preserve">5. Configure WiFi 6. Choose your Home WiFi Network and enter password. 7. Leave all other parameters as they are. </w:t>
+        <w:t xml:space="preserve">5. Configure </w:t>
+      </w:r>
+      <w:proofErr w:type="spellStart"/>
+      <w:r>
+        <w:rPr>
+          <w:lang w:val="en-US"/>
+        </w:rPr>
+        <w:t>WiFi</w:t>
+      </w:r>
+      <w:proofErr w:type="spellEnd"/>
+      <w:r>
+        <w:rPr>
+          <w:lang w:val="en-US"/>
+        </w:rPr>
+        <w:t xml:space="preserve"> 6. Choose your Home </w:t>
+      </w:r>
+      <w:proofErr w:type="spellStart"/>
+      <w:r>
+        <w:rPr>
+          <w:lang w:val="en-US"/>
+        </w:rPr>
+        <w:t>WiFi</w:t>
+      </w:r>
+      <w:proofErr w:type="spellEnd"/>
+      <w:r>
+        <w:rPr>
+          <w:lang w:val="en-US"/>
+        </w:rPr>
+        <w:t xml:space="preserve"> Network and enter password. 7. Leave all other parameters as they are. </w:t>
       </w:r>
     </w:p>
     <w:p/>
@@ -898,16 +942,8 @@
         <w:rPr>
           <w:lang w:val="en-US"/>
         </w:rPr>
-        <w:t>Send message /start or /</w:t>
-      </w:r>
-      <w:proofErr w:type="gramStart"/>
-      <w:r>
-        <w:rPr>
-          <w:lang w:val="en-US"/>
-        </w:rPr>
-        <w:t>register</w:t>
-      </w:r>
-      <w:proofErr w:type="gramEnd"/>
+        <w:t>Send message /start or /register</w:t>
+      </w:r>
     </w:p>
     <w:p>
       <w:pPr>
@@ -918,10 +954,11 @@
       </w:pPr>
       <w:r>
         <w:rPr>
+          <w:noProof/>
           <w:lang w:val="en-US"/>
         </w:rPr>
         <w:drawing>
-          <wp:anchor distT="0" distB="0" distL="114300" distR="114300" simplePos="0" relativeHeight="251718144" behindDoc="1" locked="0" layoutInCell="1" allowOverlap="1" wp14:anchorId="53ADA469" wp14:editId="0AEDFD28">
+          <wp:anchor distT="0" distB="0" distL="114300" distR="114300" simplePos="0" relativeHeight="251718144" behindDoc="1" locked="0" layoutInCell="1" allowOverlap="1" wp14:anchorId="53ADA469" wp14:editId="14BA4EDE">
             <wp:simplePos x="0" y="0"/>
             <wp:positionH relativeFrom="column">
               <wp:posOffset>1532890</wp:posOffset>
@@ -954,6 +991,15 @@
                   <pic:blipFill>
                     <a:blip r:embed="rId15" cstate="print">
                       <a:extLst>
+                        <a:ext uri="{BEBA8EAE-BF5A-486C-A8C5-ECC9F3942E4B}">
+                          <a14:imgProps xmlns:a14="http://schemas.microsoft.com/office/drawing/2010/main">
+                            <a14:imgLayer r:embed="rId16">
+                              <a14:imgEffect>
+                                <a14:brightnessContrast bright="40000" contrast="-40000"/>
+                              </a14:imgEffect>
+                            </a14:imgLayer>
+                          </a14:imgProps>
+                        </a:ext>
                         <a:ext uri="{28A0092B-C50C-407E-A947-70E740481C1C}">
                           <a14:useLocalDpi xmlns:a14="http://schemas.microsoft.com/office/drawing/2010/main" val="0"/>
                         </a:ext>
@@ -1054,11 +1100,12 @@
       </w:pPr>
       <w:r>
         <w:rPr>
+          <w:noProof/>
           <w:color w:val="FF0000"/>
           <w:lang w:val="en-US"/>
         </w:rPr>
         <w:drawing>
-          <wp:anchor distT="0" distB="0" distL="114300" distR="114300" simplePos="0" relativeHeight="251749888" behindDoc="1" locked="0" layoutInCell="1" allowOverlap="1" wp14:anchorId="78402E6C" wp14:editId="7ED7AF9D">
+          <wp:anchor distT="0" distB="0" distL="114300" distR="114300" simplePos="0" relativeHeight="251749888" behindDoc="1" locked="0" layoutInCell="1" allowOverlap="1" wp14:anchorId="78402E6C" wp14:editId="40E99448">
             <wp:simplePos x="0" y="0"/>
             <wp:positionH relativeFrom="column">
               <wp:posOffset>4257675</wp:posOffset>
@@ -1089,8 +1136,17 @@
                     <pic:cNvPicPr/>
                   </pic:nvPicPr>
                   <pic:blipFill>
-                    <a:blip r:embed="rId16" cstate="print">
+                    <a:blip r:embed="rId17" cstate="print">
                       <a:extLst>
+                        <a:ext uri="{BEBA8EAE-BF5A-486C-A8C5-ECC9F3942E4B}">
+                          <a14:imgProps xmlns:a14="http://schemas.microsoft.com/office/drawing/2010/main">
+                            <a14:imgLayer r:embed="rId18">
+                              <a14:imgEffect>
+                                <a14:brightnessContrast bright="40000" contrast="-40000"/>
+                              </a14:imgEffect>
+                            </a14:imgLayer>
+                          </a14:imgProps>
+                        </a:ext>
                         <a:ext uri="{28A0092B-C50C-407E-A947-70E740481C1C}">
                           <a14:useLocalDpi xmlns:a14="http://schemas.microsoft.com/office/drawing/2010/main" val="0"/>
                         </a:ext>
@@ -1123,11 +1179,12 @@
       </w:r>
       <w:r>
         <w:rPr>
+          <w:noProof/>
           <w:color w:val="FF0000"/>
           <w:lang w:val="en-US"/>
         </w:rPr>
         <w:drawing>
-          <wp:anchor distT="0" distB="0" distL="114300" distR="114300" simplePos="0" relativeHeight="251747840" behindDoc="1" locked="0" layoutInCell="1" allowOverlap="1" wp14:anchorId="5DCC0A56" wp14:editId="73A98B75">
+          <wp:anchor distT="0" distB="0" distL="114300" distR="114300" simplePos="0" relativeHeight="251747840" behindDoc="1" locked="0" layoutInCell="1" allowOverlap="1" wp14:anchorId="5DCC0A56" wp14:editId="51D3AEE6">
             <wp:simplePos x="0" y="0"/>
             <wp:positionH relativeFrom="column">
               <wp:posOffset>1885950</wp:posOffset>
@@ -1158,8 +1215,17 @@
                     <pic:cNvPicPr/>
                   </pic:nvPicPr>
                   <pic:blipFill>
-                    <a:blip r:embed="rId17" cstate="print">
+                    <a:blip r:embed="rId19" cstate="print">
                       <a:extLst>
+                        <a:ext uri="{BEBA8EAE-BF5A-486C-A8C5-ECC9F3942E4B}">
+                          <a14:imgProps xmlns:a14="http://schemas.microsoft.com/office/drawing/2010/main">
+                            <a14:imgLayer r:embed="rId20">
+                              <a14:imgEffect>
+                                <a14:brightnessContrast bright="40000" contrast="-40000"/>
+                              </a14:imgEffect>
+                            </a14:imgLayer>
+                          </a14:imgProps>
+                        </a:ext>
                         <a:ext uri="{28A0092B-C50C-407E-A947-70E740481C1C}">
                           <a14:useLocalDpi xmlns:a14="http://schemas.microsoft.com/office/drawing/2010/main" val="0"/>
                         </a:ext>
@@ -1192,10 +1258,11 @@
       </w:r>
       <w:r>
         <w:rPr>
+          <w:noProof/>
           <w:lang w:val="en-US"/>
         </w:rPr>
         <w:drawing>
-          <wp:anchor distT="0" distB="0" distL="114300" distR="114300" simplePos="0" relativeHeight="251739648" behindDoc="1" locked="0" layoutInCell="1" allowOverlap="1" wp14:anchorId="3EB26AE5" wp14:editId="2EC26BAD">
+          <wp:anchor distT="0" distB="0" distL="114300" distR="114300" simplePos="0" relativeHeight="251739648" behindDoc="1" locked="0" layoutInCell="1" allowOverlap="1" wp14:anchorId="3EB26AE5" wp14:editId="4A7050AC">
             <wp:simplePos x="0" y="0"/>
             <wp:positionH relativeFrom="column">
               <wp:posOffset>-409575</wp:posOffset>
@@ -1226,8 +1293,17 @@
                     <pic:cNvPicPr/>
                   </pic:nvPicPr>
                   <pic:blipFill>
-                    <a:blip r:embed="rId18" cstate="print">
+                    <a:blip r:embed="rId21" cstate="print">
                       <a:extLst>
+                        <a:ext uri="{BEBA8EAE-BF5A-486C-A8C5-ECC9F3942E4B}">
+                          <a14:imgProps xmlns:a14="http://schemas.microsoft.com/office/drawing/2010/main">
+                            <a14:imgLayer r:embed="rId22">
+                              <a14:imgEffect>
+                                <a14:brightnessContrast bright="40000" contrast="-40000"/>
+                              </a14:imgEffect>
+                            </a14:imgLayer>
+                          </a14:imgProps>
+                        </a:ext>
                         <a:ext uri="{28A0092B-C50C-407E-A947-70E740481C1C}">
                           <a14:useLocalDpi xmlns:a14="http://schemas.microsoft.com/office/drawing/2010/main" val="0"/>
                         </a:ext>
@@ -1333,7 +1409,7 @@
 </file>
 
 <file path=word/endnotes.xml><?xml version="1.0" encoding="utf-8"?>
-<w:endnotes xmlns:wpc="http://schemas.microsoft.com/office/word/2010/wordprocessingCanvas" xmlns:cx="http://schemas.microsoft.com/office/drawing/2014/chartex" xmlns:cx1="http://schemas.microsoft.com/office/drawing/2015/9/8/chartex" xmlns:cx2="http://schemas.microsoft.com/office/drawing/2015/10/21/chartex" xmlns:cx3="http://schemas.microsoft.com/office/drawing/2016/5/9/chartex" xmlns:cx4="http://schemas.microsoft.com/office/drawing/2016/5/10/chartex" xmlns:cx5="http://schemas.microsoft.com/office/drawing/2016/5/11/chartex" xmlns:cx6="http://schemas.microsoft.com/office/drawing/2016/5/12/chartex" xmlns:cx7="http://schemas.microsoft.com/office/drawing/2016/5/13/chartex" xmlns:cx8="http://schemas.microsoft.com/office/drawing/2016/5/14/chartex" xmlns:mc="http://schemas.openxmlformats.org/markup-compatibility/2006" xmlns:aink="http://schemas.microsoft.com/office/drawing/2016/ink" xmlns:am3d="http://schemas.microsoft.com/office/drawing/2017/model3d" xmlns:o="urn:schemas-microsoft-com:office:office" xmlns:oel="http://schemas.microsoft.com/office/2019/extlst" xmlns:r="http://schemas.openxmlformats.org/officeDocument/2006/relationships" xmlns:m="http://schemas.openxmlformats.org/officeDocument/2006/math" xmlns:v="urn:schemas-microsoft-com:vml" xmlns:wp14="http://schemas.microsoft.com/office/word/2010/wordprocessingDrawing" xmlns:wp="http://schemas.openxmlformats.org/drawingml/2006/wordprocessingDrawing" xmlns:w10="urn:schemas-microsoft-com:office:word" xmlns:w="http://schemas.openxmlformats.org/wordprocessingml/2006/main" xmlns:w14="http://schemas.microsoft.com/office/word/2010/wordml" xmlns:w15="http://schemas.microsoft.com/office/word/2012/wordml" xmlns:w16cex="http://schemas.microsoft.com/office/word/2018/wordml/cex" xmlns:w16cid="http://schemas.microsoft.com/office/word/2016/wordml/cid" xmlns:w16="http://schemas.microsoft.com/office/word/2018/wordml" xmlns:w16du="http://schemas.microsoft.com/office/word/2023/wordml/word16du" xmlns:w16sdtdh="http://schemas.microsoft.com/office/word/2020/wordml/sdtdatahash" xmlns:w16se="http://schemas.microsoft.com/office/word/2015/wordml/symex" xmlns:wpg="http://schemas.microsoft.com/office/word/2010/wordprocessingGroup" xmlns:wpi="http://schemas.microsoft.com/office/word/2010/wordprocessingInk" xmlns:wne="http://schemas.microsoft.com/office/word/2006/wordml" xmlns:wps="http://schemas.microsoft.com/office/word/2010/wordprocessingShape" mc:Ignorable="w14 w15 w16se w16cid w16 w16cex w16sdtdh w16du wp14">
+<w:endnotes xmlns:wpc="http://schemas.microsoft.com/office/word/2010/wordprocessingCanvas" xmlns:cx="http://schemas.microsoft.com/office/drawing/2014/chartex" xmlns:cx1="http://schemas.microsoft.com/office/drawing/2015/9/8/chartex" xmlns:cx2="http://schemas.microsoft.com/office/drawing/2015/10/21/chartex" xmlns:cx3="http://schemas.microsoft.com/office/drawing/2016/5/9/chartex" xmlns:cx4="http://schemas.microsoft.com/office/drawing/2016/5/10/chartex" xmlns:cx5="http://schemas.microsoft.com/office/drawing/2016/5/11/chartex" xmlns:cx6="http://schemas.microsoft.com/office/drawing/2016/5/12/chartex" xmlns:cx7="http://schemas.microsoft.com/office/drawing/2016/5/13/chartex" xmlns:cx8="http://schemas.microsoft.com/office/drawing/2016/5/14/chartex" xmlns:mc="http://schemas.openxmlformats.org/markup-compatibility/2006" xmlns:aink="http://schemas.microsoft.com/office/drawing/2016/ink" xmlns:am3d="http://schemas.microsoft.com/office/drawing/2017/model3d" xmlns:o="urn:schemas-microsoft-com:office:office" xmlns:oel="http://schemas.microsoft.com/office/2019/extlst" xmlns:r="http://schemas.openxmlformats.org/officeDocument/2006/relationships" xmlns:m="http://schemas.openxmlformats.org/officeDocument/2006/math" xmlns:v="urn:schemas-microsoft-com:vml" xmlns:wp14="http://schemas.microsoft.com/office/word/2010/wordprocessingDrawing" xmlns:wp="http://schemas.openxmlformats.org/drawingml/2006/wordprocessingDrawing" xmlns:w10="urn:schemas-microsoft-com:office:word" xmlns:w="http://schemas.openxmlformats.org/wordprocessingml/2006/main" xmlns:w14="http://schemas.microsoft.com/office/word/2010/wordml" xmlns:w15="http://schemas.microsoft.com/office/word/2012/wordml" xmlns:w16cex="http://schemas.microsoft.com/office/word/2018/wordml/cex" xmlns:w16cid="http://schemas.microsoft.com/office/word/2016/wordml/cid" xmlns:w16="http://schemas.microsoft.com/office/word/2018/wordml" xmlns:w16du="http://schemas.microsoft.com/office/word/2023/wordml/word16du" xmlns:w16sdtdh="http://schemas.microsoft.com/office/word/2020/wordml/sdtdatahash" xmlns:w16sdtfl="http://schemas.microsoft.com/office/word/2024/wordml/sdtformatlock" xmlns:w16se="http://schemas.microsoft.com/office/word/2015/wordml/symex" xmlns:wpg="http://schemas.microsoft.com/office/word/2010/wordprocessingGroup" xmlns:wpi="http://schemas.microsoft.com/office/word/2010/wordprocessingInk" xmlns:wne="http://schemas.microsoft.com/office/word/2006/wordml" xmlns:wps="http://schemas.microsoft.com/office/word/2010/wordprocessingShape" mc:Ignorable="w14 w15 w16se w16cid w16 w16cex w16sdtdh w16sdtfl w16du wp14">
   <w:endnote w:type="separator" w:id="-1">
     <w:p>
       <w:pPr>
@@ -1358,7 +1434,7 @@
 </file>
 
 <file path=word/footnotes.xml><?xml version="1.0" encoding="utf-8"?>
-<w:footnotes xmlns:wpc="http://schemas.microsoft.com/office/word/2010/wordprocessingCanvas" xmlns:cx="http://schemas.microsoft.com/office/drawing/2014/chartex" xmlns:cx1="http://schemas.microsoft.com/office/drawing/2015/9/8/chartex" xmlns:cx2="http://schemas.microsoft.com/office/drawing/2015/10/21/chartex" xmlns:cx3="http://schemas.microsoft.com/office/drawing/2016/5/9/chartex" xmlns:cx4="http://schemas.microsoft.com/office/drawing/2016/5/10/chartex" xmlns:cx5="http://schemas.microsoft.com/office/drawing/2016/5/11/chartex" xmlns:cx6="http://schemas.microsoft.com/office/drawing/2016/5/12/chartex" xmlns:cx7="http://schemas.microsoft.com/office/drawing/2016/5/13/chartex" xmlns:cx8="http://schemas.microsoft.com/office/drawing/2016/5/14/chartex" xmlns:mc="http://schemas.openxmlformats.org/markup-compatibility/2006" xmlns:aink="http://schemas.microsoft.com/office/drawing/2016/ink" xmlns:am3d="http://schemas.microsoft.com/office/drawing/2017/model3d" xmlns:o="urn:schemas-microsoft-com:office:office" xmlns:oel="http://schemas.microsoft.com/office/2019/extlst" xmlns:r="http://schemas.openxmlformats.org/officeDocument/2006/relationships" xmlns:m="http://schemas.openxmlformats.org/officeDocument/2006/math" xmlns:v="urn:schemas-microsoft-com:vml" xmlns:wp14="http://schemas.microsoft.com/office/word/2010/wordprocessingDrawing" xmlns:wp="http://schemas.openxmlformats.org/drawingml/2006/wordprocessingDrawing" xmlns:w10="urn:schemas-microsoft-com:office:word" xmlns:w="http://schemas.openxmlformats.org/wordprocessingml/2006/main" xmlns:w14="http://schemas.microsoft.com/office/word/2010/wordml" xmlns:w15="http://schemas.microsoft.com/office/word/2012/wordml" xmlns:w16cex="http://schemas.microsoft.com/office/word/2018/wordml/cex" xmlns:w16cid="http://schemas.microsoft.com/office/word/2016/wordml/cid" xmlns:w16="http://schemas.microsoft.com/office/word/2018/wordml" xmlns:w16du="http://schemas.microsoft.com/office/word/2023/wordml/word16du" xmlns:w16sdtdh="http://schemas.microsoft.com/office/word/2020/wordml/sdtdatahash" xmlns:w16se="http://schemas.microsoft.com/office/word/2015/wordml/symex" xmlns:wpg="http://schemas.microsoft.com/office/word/2010/wordprocessingGroup" xmlns:wpi="http://schemas.microsoft.com/office/word/2010/wordprocessingInk" xmlns:wne="http://schemas.microsoft.com/office/word/2006/wordml" xmlns:wps="http://schemas.microsoft.com/office/word/2010/wordprocessingShape" mc:Ignorable="w14 w15 w16se w16cid w16 w16cex w16sdtdh w16du wp14">
+<w:footnotes xmlns:wpc="http://schemas.microsoft.com/office/word/2010/wordprocessingCanvas" xmlns:cx="http://schemas.microsoft.com/office/drawing/2014/chartex" xmlns:cx1="http://schemas.microsoft.com/office/drawing/2015/9/8/chartex" xmlns:cx2="http://schemas.microsoft.com/office/drawing/2015/10/21/chartex" xmlns:cx3="http://schemas.microsoft.com/office/drawing/2016/5/9/chartex" xmlns:cx4="http://schemas.microsoft.com/office/drawing/2016/5/10/chartex" xmlns:cx5="http://schemas.microsoft.com/office/drawing/2016/5/11/chartex" xmlns:cx6="http://schemas.microsoft.com/office/drawing/2016/5/12/chartex" xmlns:cx7="http://schemas.microsoft.com/office/drawing/2016/5/13/chartex" xmlns:cx8="http://schemas.microsoft.com/office/drawing/2016/5/14/chartex" xmlns:mc="http://schemas.openxmlformats.org/markup-compatibility/2006" xmlns:aink="http://schemas.microsoft.com/office/drawing/2016/ink" xmlns:am3d="http://schemas.microsoft.com/office/drawing/2017/model3d" xmlns:o="urn:schemas-microsoft-com:office:office" xmlns:oel="http://schemas.microsoft.com/office/2019/extlst" xmlns:r="http://schemas.openxmlformats.org/officeDocument/2006/relationships" xmlns:m="http://schemas.openxmlformats.org/officeDocument/2006/math" xmlns:v="urn:schemas-microsoft-com:vml" xmlns:wp14="http://schemas.microsoft.com/office/word/2010/wordprocessingDrawing" xmlns:wp="http://schemas.openxmlformats.org/drawingml/2006/wordprocessingDrawing" xmlns:w10="urn:schemas-microsoft-com:office:word" xmlns:w="http://schemas.openxmlformats.org/wordprocessingml/2006/main" xmlns:w14="http://schemas.microsoft.com/office/word/2010/wordml" xmlns:w15="http://schemas.microsoft.com/office/word/2012/wordml" xmlns:w16cex="http://schemas.microsoft.com/office/word/2018/wordml/cex" xmlns:w16cid="http://schemas.microsoft.com/office/word/2016/wordml/cid" xmlns:w16="http://schemas.microsoft.com/office/word/2018/wordml" xmlns:w16du="http://schemas.microsoft.com/office/word/2023/wordml/word16du" xmlns:w16sdtdh="http://schemas.microsoft.com/office/word/2020/wordml/sdtdatahash" xmlns:w16sdtfl="http://schemas.microsoft.com/office/word/2024/wordml/sdtformatlock" xmlns:w16se="http://schemas.microsoft.com/office/word/2015/wordml/symex" xmlns:wpg="http://schemas.microsoft.com/office/word/2010/wordprocessingGroup" xmlns:wpi="http://schemas.microsoft.com/office/word/2010/wordprocessingInk" xmlns:wne="http://schemas.microsoft.com/office/word/2006/wordml" xmlns:wps="http://schemas.microsoft.com/office/word/2010/wordprocessingShape" mc:Ignorable="w14 w15 w16se w16cid w16 w16cex w16sdtdh w16sdtfl w16du wp14">
   <w:footnote w:type="separator" w:id="-1">
     <w:p>
       <w:pPr>
@@ -1383,7 +1459,7 @@
 </file>
 
 <file path=word/numbering.xml><?xml version="1.0" encoding="utf-8"?>
-<w:numbering xmlns:wpc="http://schemas.microsoft.com/office/word/2010/wordprocessingCanvas" xmlns:cx="http://schemas.microsoft.com/office/drawing/2014/chartex" xmlns:cx1="http://schemas.microsoft.com/office/drawing/2015/9/8/chartex" xmlns:cx2="http://schemas.microsoft.com/office/drawing/2015/10/21/chartex" xmlns:cx3="http://schemas.microsoft.com/office/drawing/2016/5/9/chartex" xmlns:cx4="http://schemas.microsoft.com/office/drawing/2016/5/10/chartex" xmlns:cx5="http://schemas.microsoft.com/office/drawing/2016/5/11/chartex" xmlns:cx6="http://schemas.microsoft.com/office/drawing/2016/5/12/chartex" xmlns:cx7="http://schemas.microsoft.com/office/drawing/2016/5/13/chartex" xmlns:cx8="http://schemas.microsoft.com/office/drawing/2016/5/14/chartex" xmlns:mc="http://schemas.openxmlformats.org/markup-compatibility/2006" xmlns:aink="http://schemas.microsoft.com/office/drawing/2016/ink" xmlns:am3d="http://schemas.microsoft.com/office/drawing/2017/model3d" xmlns:o="urn:schemas-microsoft-com:office:office" xmlns:oel="http://schemas.microsoft.com/office/2019/extlst" xmlns:r="http://schemas.openxmlformats.org/officeDocument/2006/relationships" xmlns:m="http://schemas.openxmlformats.org/officeDocument/2006/math" xmlns:v="urn:schemas-microsoft-com:vml" xmlns:wp14="http://schemas.microsoft.com/office/word/2010/wordprocessingDrawing" xmlns:wp="http://schemas.openxmlformats.org/drawingml/2006/wordprocessingDrawing" xmlns:w10="urn:schemas-microsoft-com:office:word" xmlns:w="http://schemas.openxmlformats.org/wordprocessingml/2006/main" xmlns:w14="http://schemas.microsoft.com/office/word/2010/wordml" xmlns:w15="http://schemas.microsoft.com/office/word/2012/wordml" xmlns:w16cex="http://schemas.microsoft.com/office/word/2018/wordml/cex" xmlns:w16cid="http://schemas.microsoft.com/office/word/2016/wordml/cid" xmlns:w16="http://schemas.microsoft.com/office/word/2018/wordml" xmlns:w16du="http://schemas.microsoft.com/office/word/2023/wordml/word16du" xmlns:w16sdtdh="http://schemas.microsoft.com/office/word/2020/wordml/sdtdatahash" xmlns:w16se="http://schemas.microsoft.com/office/word/2015/wordml/symex" xmlns:wpg="http://schemas.microsoft.com/office/word/2010/wordprocessingGroup" xmlns:wpi="http://schemas.microsoft.com/office/word/2010/wordprocessingInk" xmlns:wne="http://schemas.microsoft.com/office/word/2006/wordml" xmlns:wps="http://schemas.microsoft.com/office/word/2010/wordprocessingShape" mc:Ignorable="w14 w15 w16se w16cid w16 w16cex w16sdtdh w16du wp14">
+<w:numbering xmlns:wpc="http://schemas.microsoft.com/office/word/2010/wordprocessingCanvas" xmlns:cx="http://schemas.microsoft.com/office/drawing/2014/chartex" xmlns:cx1="http://schemas.microsoft.com/office/drawing/2015/9/8/chartex" xmlns:cx2="http://schemas.microsoft.com/office/drawing/2015/10/21/chartex" xmlns:cx3="http://schemas.microsoft.com/office/drawing/2016/5/9/chartex" xmlns:cx4="http://schemas.microsoft.com/office/drawing/2016/5/10/chartex" xmlns:cx5="http://schemas.microsoft.com/office/drawing/2016/5/11/chartex" xmlns:cx6="http://schemas.microsoft.com/office/drawing/2016/5/12/chartex" xmlns:cx7="http://schemas.microsoft.com/office/drawing/2016/5/13/chartex" xmlns:cx8="http://schemas.microsoft.com/office/drawing/2016/5/14/chartex" xmlns:mc="http://schemas.openxmlformats.org/markup-compatibility/2006" xmlns:aink="http://schemas.microsoft.com/office/drawing/2016/ink" xmlns:am3d="http://schemas.microsoft.com/office/drawing/2017/model3d" xmlns:o="urn:schemas-microsoft-com:office:office" xmlns:oel="http://schemas.microsoft.com/office/2019/extlst" xmlns:r="http://schemas.openxmlformats.org/officeDocument/2006/relationships" xmlns:m="http://schemas.openxmlformats.org/officeDocument/2006/math" xmlns:v="urn:schemas-microsoft-com:vml" xmlns:wp14="http://schemas.microsoft.com/office/word/2010/wordprocessingDrawing" xmlns:wp="http://schemas.openxmlformats.org/drawingml/2006/wordprocessingDrawing" xmlns:w10="urn:schemas-microsoft-com:office:word" xmlns:w="http://schemas.openxmlformats.org/wordprocessingml/2006/main" xmlns:w14="http://schemas.microsoft.com/office/word/2010/wordml" xmlns:w15="http://schemas.microsoft.com/office/word/2012/wordml" xmlns:w16cex="http://schemas.microsoft.com/office/word/2018/wordml/cex" xmlns:w16cid="http://schemas.microsoft.com/office/word/2016/wordml/cid" xmlns:w16="http://schemas.microsoft.com/office/word/2018/wordml" xmlns:w16du="http://schemas.microsoft.com/office/word/2023/wordml/word16du" xmlns:w16sdtdh="http://schemas.microsoft.com/office/word/2020/wordml/sdtdatahash" xmlns:w16sdtfl="http://schemas.microsoft.com/office/word/2024/wordml/sdtformatlock" xmlns:w16se="http://schemas.microsoft.com/office/word/2015/wordml/symex" xmlns:wpg="http://schemas.microsoft.com/office/word/2010/wordprocessingGroup" xmlns:wpi="http://schemas.microsoft.com/office/word/2010/wordprocessingInk" xmlns:wne="http://schemas.microsoft.com/office/word/2006/wordml" xmlns:wps="http://schemas.microsoft.com/office/word/2010/wordprocessingShape" mc:Ignorable="w14 w15 w16se w16cid w16 w16cex w16sdtdh w16sdtfl w16du wp14">
   <w:abstractNum w:abstractNumId="0" w15:restartNumberingAfterBreak="0">
     <w:nsid w:val="1DA86182"/>
     <w:multiLevelType w:val="hybridMultilevel"/>
@@ -1756,7 +1832,7 @@
 </file>
 
 <file path=word/styles.xml><?xml version="1.0" encoding="utf-8"?>
-<w:styles xmlns:mc="http://schemas.openxmlformats.org/markup-compatibility/2006" xmlns:r="http://schemas.openxmlformats.org/officeDocument/2006/relationships" xmlns:w="http://schemas.openxmlformats.org/wordprocessingml/2006/main" xmlns:w14="http://schemas.microsoft.com/office/word/2010/wordml" xmlns:w15="http://schemas.microsoft.com/office/word/2012/wordml" xmlns:w16cex="http://schemas.microsoft.com/office/word/2018/wordml/cex" xmlns:w16cid="http://schemas.microsoft.com/office/word/2016/wordml/cid" xmlns:w16="http://schemas.microsoft.com/office/word/2018/wordml" xmlns:w16du="http://schemas.microsoft.com/office/word/2023/wordml/word16du" xmlns:w16sdtdh="http://schemas.microsoft.com/office/word/2020/wordml/sdtdatahash" xmlns:w16se="http://schemas.microsoft.com/office/word/2015/wordml/symex" mc:Ignorable="w14 w15 w16se w16cid w16 w16cex w16sdtdh w16du">
+<w:styles xmlns:mc="http://schemas.openxmlformats.org/markup-compatibility/2006" xmlns:r="http://schemas.openxmlformats.org/officeDocument/2006/relationships" xmlns:w="http://schemas.openxmlformats.org/wordprocessingml/2006/main" xmlns:w14="http://schemas.microsoft.com/office/word/2010/wordml" xmlns:w15="http://schemas.microsoft.com/office/word/2012/wordml" xmlns:w16cex="http://schemas.microsoft.com/office/word/2018/wordml/cex" xmlns:w16cid="http://schemas.microsoft.com/office/word/2016/wordml/cid" xmlns:w16="http://schemas.microsoft.com/office/word/2018/wordml" xmlns:w16du="http://schemas.microsoft.com/office/word/2023/wordml/word16du" xmlns:w16sdtdh="http://schemas.microsoft.com/office/word/2020/wordml/sdtdatahash" xmlns:w16sdtfl="http://schemas.microsoft.com/office/word/2024/wordml/sdtformatlock" xmlns:w16se="http://schemas.microsoft.com/office/word/2015/wordml/symex" mc:Ignorable="w14 w15 w16se w16cid w16 w16cex w16sdtdh w16sdtfl w16du">
   <w:docDefaults>
     <w:rPrDefault>
       <w:rPr>
@@ -2357,6 +2433,7 @@
   <w:style w:type="character" w:default="1" w:styleId="DefaultParagraphFont">
     <w:name w:val="Default Paragraph Font"/>
     <w:uiPriority w:val="1"/>
+    <w:semiHidden/>
     <w:unhideWhenUsed/>
   </w:style>
   <w:style w:type="table" w:default="1" w:styleId="TableNormal">

</xml_diff>